<commit_message>
court(nh): petition for rehearing, writ and review regenerated on the model at HEAD, gated (one engine reported each) (fb-595.54.24)
Co-Authored-By: Claude Opus 5.5 <noreply@anthropic.com>
</commit_message>
<xml_diff>
--- a/courts/first-circuit/new-hampshire/state/supreme-court/petition-for-rehearing/usage/OUTPUT-petition-for-rehearing.docx
+++ b/courts/first-circuit/new-hampshire/state/supreme-court/petition-for-rehearing/usage/OUTPUT-petition-for-rehearing.docx
@@ -3975,6 +3975,7 @@
     <w:unhideWhenUsed/>
     <w:qFormat/>
     <w:pPr>
+      <w:keepLines/>
       <w:spacing w:before="0" w:after="150" w:line="299" w:lineRule="exact"/>
     </w:pPr>
     <w:rPr>
@@ -4225,6 +4226,33 @@
     <w:pPr>
       <w:spacing w:before="0" w:after="0" w:line="299" w:lineRule="exact"/>
       <w:ind w:left="1296" w:hanging="432"/>
+    </w:pPr>
+  </w:style>
+  <w:style w:type="paragraph" w:customStyle="1" w:styleId="XdQuoteList1">
+    <w:name w:val="Xd Quote List 1"/>
+    <w:basedOn w:val="Normal"/>
+    <w:qFormat/>
+    <w:pPr>
+      <w:spacing w:before="0" w:after="0" w:line="449" w:lineRule="exact"/>
+      <w:ind w:left="1152" w:right="720" w:hanging="432"/>
+    </w:pPr>
+  </w:style>
+  <w:style w:type="paragraph" w:customStyle="1" w:styleId="XdQuoteList2">
+    <w:name w:val="Xd Quote List 2"/>
+    <w:basedOn w:val="Normal"/>
+    <w:qFormat/>
+    <w:pPr>
+      <w:spacing w:before="0" w:after="0" w:line="449" w:lineRule="exact"/>
+      <w:ind w:left="1584" w:right="720" w:hanging="432"/>
+    </w:pPr>
+  </w:style>
+  <w:style w:type="paragraph" w:customStyle="1" w:styleId="XdQuoteList3">
+    <w:name w:val="Xd Quote List 3"/>
+    <w:basedOn w:val="Normal"/>
+    <w:qFormat/>
+    <w:pPr>
+      <w:spacing w:before="0" w:after="0" w:line="449" w:lineRule="exact"/>
+      <w:ind w:left="2016" w:right="720" w:hanging="432"/>
     </w:pPr>
   </w:style>
   <w:style w:type="paragraph" w:customStyle="1" w:styleId="XdQuoteOnly">

</xml_diff>